<commit_message>
Novela: mezclar tipos en olas y añadir arquetipos fantasma; enemigos.txt: descripciones detalladas de seres reales; regenerar NOVELA.docx
</commit_message>
<xml_diff>
--- a/Novela/NPAD_NOVELA.docx
+++ b/Novela/NPAD_NOVELA.docx
@@ -177,12 +177,6 @@
         <w:instrText xml:space="preserve"> PAGEREF _Toc_indice \h </w:instrText>
       </w:r>
       <w:r>
-        <w:fldChar w:fldCharType="separate"/>
-      </w:r>
-      <w:r>
-        <w:t xml:space="preserve">3</w:t>
-      </w:r>
-      <w:r>
         <w:fldChar w:fldCharType="end"/>
       </w:r>
     </w:p>
@@ -203,12 +197,6 @@
         <w:instrText xml:space="preserve"> PAGEREF _Toc_cap1 \h </w:instrText>
       </w:r>
       <w:r>
-        <w:fldChar w:fldCharType="separate"/>
-      </w:r>
-      <w:r>
-        <w:t xml:space="preserve">6</w:t>
-      </w:r>
-      <w:r>
         <w:fldChar w:fldCharType="end"/>
       </w:r>
     </w:p>
@@ -229,12 +217,6 @@
         <w:instrText xml:space="preserve"> PAGEREF _Toc_cap2 \h </w:instrText>
       </w:r>
       <w:r>
-        <w:fldChar w:fldCharType="separate"/>
-      </w:r>
-      <w:r>
-        <w:t xml:space="preserve">21</w:t>
-      </w:r>
-      <w:r>
         <w:fldChar w:fldCharType="end"/>
       </w:r>
     </w:p>
@@ -255,12 +237,6 @@
         <w:instrText xml:space="preserve"> PAGEREF _Toc_cap3 \h </w:instrText>
       </w:r>
       <w:r>
-        <w:fldChar w:fldCharType="separate"/>
-      </w:r>
-      <w:r>
-        <w:t xml:space="preserve">30</w:t>
-      </w:r>
-      <w:r>
         <w:fldChar w:fldCharType="end"/>
       </w:r>
     </w:p>
@@ -281,12 +257,6 @@
         <w:instrText xml:space="preserve"> PAGEREF _Toc_cap4 \h </w:instrText>
       </w:r>
       <w:r>
-        <w:fldChar w:fldCharType="separate"/>
-      </w:r>
-      <w:r>
-        <w:t xml:space="preserve">39</w:t>
-      </w:r>
-      <w:r>
         <w:fldChar w:fldCharType="end"/>
       </w:r>
     </w:p>
@@ -307,12 +277,6 @@
         <w:instrText xml:space="preserve"> PAGEREF _Toc_cap5 \h </w:instrText>
       </w:r>
       <w:r>
-        <w:fldChar w:fldCharType="separate"/>
-      </w:r>
-      <w:r>
-        <w:t xml:space="preserve">47</w:t>
-      </w:r>
-      <w:r>
         <w:fldChar w:fldCharType="end"/>
       </w:r>
     </w:p>
@@ -333,12 +297,6 @@
         <w:instrText xml:space="preserve"> PAGEREF _Toc_cap6 \h </w:instrText>
       </w:r>
       <w:r>
-        <w:fldChar w:fldCharType="separate"/>
-      </w:r>
-      <w:r>
-        <w:t xml:space="preserve">54</w:t>
-      </w:r>
-      <w:r>
         <w:fldChar w:fldCharType="end"/>
       </w:r>
     </w:p>
@@ -359,12 +317,6 @@
         <w:instrText xml:space="preserve"> PAGEREF _Toc_cap7 \h </w:instrText>
       </w:r>
       <w:r>
-        <w:fldChar w:fldCharType="separate"/>
-      </w:r>
-      <w:r>
-        <w:t xml:space="preserve">60</w:t>
-      </w:r>
-      <w:r>
         <w:fldChar w:fldCharType="end"/>
       </w:r>
     </w:p>
@@ -385,12 +337,6 @@
         <w:instrText xml:space="preserve"> PAGEREF _Toc_cap8 \h </w:instrText>
       </w:r>
       <w:r>
-        <w:fldChar w:fldCharType="separate"/>
-      </w:r>
-      <w:r>
-        <w:t xml:space="preserve">65</w:t>
-      </w:r>
-      <w:r>
         <w:fldChar w:fldCharType="end"/>
       </w:r>
     </w:p>
@@ -411,12 +357,6 @@
         <w:instrText xml:space="preserve"> PAGEREF _Toc_cap9 \h </w:instrText>
       </w:r>
       <w:r>
-        <w:fldChar w:fldCharType="separate"/>
-      </w:r>
-      <w:r>
-        <w:t xml:space="preserve">71</w:t>
-      </w:r>
-      <w:r>
         <w:fldChar w:fldCharType="end"/>
       </w:r>
     </w:p>
@@ -437,12 +377,6 @@
         <w:instrText xml:space="preserve"> PAGEREF _Toc_cap10 \h </w:instrText>
       </w:r>
       <w:r>
-        <w:fldChar w:fldCharType="separate"/>
-      </w:r>
-      <w:r>
-        <w:t xml:space="preserve">76</w:t>
-      </w:r>
-      <w:r>
         <w:fldChar w:fldCharType="end"/>
       </w:r>
     </w:p>
@@ -463,12 +397,6 @@
         <w:instrText xml:space="preserve"> PAGEREF _Toc_cap11 \h </w:instrText>
       </w:r>
       <w:r>
-        <w:fldChar w:fldCharType="separate"/>
-      </w:r>
-      <w:r>
-        <w:t xml:space="preserve">80</w:t>
-      </w:r>
-      <w:r>
         <w:fldChar w:fldCharType="end"/>
       </w:r>
     </w:p>
@@ -489,12 +417,6 @@
         <w:instrText xml:space="preserve"> PAGEREF _Toc_cap12 \h </w:instrText>
       </w:r>
       <w:r>
-        <w:fldChar w:fldCharType="separate"/>
-      </w:r>
-      <w:r>
-        <w:t xml:space="preserve">91</w:t>
-      </w:r>
-      <w:r>
         <w:fldChar w:fldCharType="end"/>
       </w:r>
     </w:p>
@@ -515,12 +437,6 @@
         <w:instrText xml:space="preserve"> PAGEREF _Toc_cap13 \h </w:instrText>
       </w:r>
       <w:r>
-        <w:fldChar w:fldCharType="separate"/>
-      </w:r>
-      <w:r>
-        <w:t xml:space="preserve">95</w:t>
-      </w:r>
-      <w:r>
         <w:fldChar w:fldCharType="end"/>
       </w:r>
     </w:p>
@@ -541,12 +457,6 @@
         <w:instrText xml:space="preserve"> PAGEREF _Toc_cap14 \h </w:instrText>
       </w:r>
       <w:r>
-        <w:fldChar w:fldCharType="separate"/>
-      </w:r>
-      <w:r>
-        <w:t xml:space="preserve">107</w:t>
-      </w:r>
-      <w:r>
         <w:fldChar w:fldCharType="end"/>
       </w:r>
     </w:p>
@@ -567,12 +477,6 @@
         <w:instrText xml:space="preserve"> PAGEREF _Toc_cap15 \h </w:instrText>
       </w:r>
       <w:r>
-        <w:fldChar w:fldCharType="separate"/>
-      </w:r>
-      <w:r>
-        <w:t xml:space="preserve">110</w:t>
-      </w:r>
-      <w:r>
         <w:fldChar w:fldCharType="end"/>
       </w:r>
     </w:p>
@@ -593,12 +497,6 @@
         <w:instrText xml:space="preserve"> PAGEREF _Toc_cap16 \h </w:instrText>
       </w:r>
       <w:r>
-        <w:fldChar w:fldCharType="separate"/>
-      </w:r>
-      <w:r>
-        <w:t xml:space="preserve">113</w:t>
-      </w:r>
-      <w:r>
         <w:fldChar w:fldCharType="end"/>
       </w:r>
     </w:p>
@@ -619,12 +517,6 @@
         <w:instrText xml:space="preserve"> PAGEREF _Toc_cap17 \h </w:instrText>
       </w:r>
       <w:r>
-        <w:fldChar w:fldCharType="separate"/>
-      </w:r>
-      <w:r>
-        <w:t xml:space="preserve">115</w:t>
-      </w:r>
-      <w:r>
         <w:fldChar w:fldCharType="end"/>
       </w:r>
     </w:p>
@@ -645,12 +537,6 @@
         <w:instrText xml:space="preserve"> PAGEREF _Toc_cap18 \h </w:instrText>
       </w:r>
       <w:r>
-        <w:fldChar w:fldCharType="separate"/>
-      </w:r>
-      <w:r>
-        <w:t xml:space="preserve">118</w:t>
-      </w:r>
-      <w:r>
         <w:fldChar w:fldCharType="end"/>
       </w:r>
     </w:p>
@@ -671,12 +557,6 @@
         <w:instrText xml:space="preserve"> PAGEREF _Toc_cap19 \h </w:instrText>
       </w:r>
       <w:r>
-        <w:fldChar w:fldCharType="separate"/>
-      </w:r>
-      <w:r>
-        <w:t xml:space="preserve">121</w:t>
-      </w:r>
-      <w:r>
         <w:fldChar w:fldCharType="end"/>
       </w:r>
     </w:p>
@@ -697,12 +577,6 @@
         <w:instrText xml:space="preserve"> PAGEREF _Toc_cap20 \h </w:instrText>
       </w:r>
       <w:r>
-        <w:fldChar w:fldCharType="separate"/>
-      </w:r>
-      <w:r>
-        <w:t xml:space="preserve">124</w:t>
-      </w:r>
-      <w:r>
         <w:fldChar w:fldCharType="end"/>
       </w:r>
     </w:p>
@@ -723,12 +597,6 @@
         <w:instrText xml:space="preserve"> PAGEREF _Toc_cap21 \h </w:instrText>
       </w:r>
       <w:r>
-        <w:fldChar w:fldCharType="separate"/>
-      </w:r>
-      <w:r>
-        <w:t xml:space="preserve">128</w:t>
-      </w:r>
-      <w:r>
         <w:fldChar w:fldCharType="end"/>
       </w:r>
     </w:p>
@@ -749,12 +617,6 @@
         <w:instrText xml:space="preserve"> PAGEREF _Toc_cap22 \h </w:instrText>
       </w:r>
       <w:r>
-        <w:fldChar w:fldCharType="separate"/>
-      </w:r>
-      <w:r>
-        <w:t xml:space="preserve">131</w:t>
-      </w:r>
-      <w:r>
         <w:fldChar w:fldCharType="end"/>
       </w:r>
     </w:p>
@@ -775,12 +637,6 @@
         <w:instrText xml:space="preserve"> PAGEREF _Toc_cap23 \h </w:instrText>
       </w:r>
       <w:r>
-        <w:fldChar w:fldCharType="separate"/>
-      </w:r>
-      <w:r>
-        <w:t xml:space="preserve">133</w:t>
-      </w:r>
-      <w:r>
         <w:fldChar w:fldCharType="end"/>
       </w:r>
     </w:p>
@@ -801,12 +657,6 @@
         <w:instrText xml:space="preserve"> PAGEREF _Toc_cap24 \h </w:instrText>
       </w:r>
       <w:r>
-        <w:fldChar w:fldCharType="separate"/>
-      </w:r>
-      <w:r>
-        <w:t xml:space="preserve">136</w:t>
-      </w:r>
-      <w:r>
         <w:fldChar w:fldCharType="end"/>
       </w:r>
     </w:p>
@@ -827,12 +677,6 @@
         <w:instrText xml:space="preserve"> PAGEREF _Toc_cap25 \h </w:instrText>
       </w:r>
       <w:r>
-        <w:fldChar w:fldCharType="separate"/>
-      </w:r>
-      <w:r>
-        <w:t xml:space="preserve">139</w:t>
-      </w:r>
-      <w:r>
         <w:fldChar w:fldCharType="end"/>
       </w:r>
     </w:p>
@@ -853,12 +697,6 @@
         <w:instrText xml:space="preserve"> PAGEREF _Toc_cap26 \h </w:instrText>
       </w:r>
       <w:r>
-        <w:fldChar w:fldCharType="separate"/>
-      </w:r>
-      <w:r>
-        <w:t xml:space="preserve">142</w:t>
-      </w:r>
-      <w:r>
         <w:fldChar w:fldCharType="end"/>
       </w:r>
     </w:p>
@@ -879,12 +717,6 @@
         <w:instrText xml:space="preserve"> PAGEREF _Toc_cap27 \h </w:instrText>
       </w:r>
       <w:r>
-        <w:fldChar w:fldCharType="separate"/>
-      </w:r>
-      <w:r>
-        <w:t xml:space="preserve">143</w:t>
-      </w:r>
-      <w:r>
         <w:fldChar w:fldCharType="end"/>
       </w:r>
     </w:p>
@@ -905,12 +737,6 @@
         <w:instrText xml:space="preserve"> PAGEREF _Toc_cap28 \h </w:instrText>
       </w:r>
       <w:r>
-        <w:fldChar w:fldCharType="separate"/>
-      </w:r>
-      <w:r>
-        <w:t xml:space="preserve">145</w:t>
-      </w:r>
-      <w:r>
         <w:fldChar w:fldCharType="end"/>
       </w:r>
     </w:p>
@@ -931,12 +757,6 @@
         <w:instrText xml:space="preserve"> PAGEREF _Toc_cap29 \h </w:instrText>
       </w:r>
       <w:r>
-        <w:fldChar w:fldCharType="separate"/>
-      </w:r>
-      <w:r>
-        <w:t xml:space="preserve">147</w:t>
-      </w:r>
-      <w:r>
         <w:fldChar w:fldCharType="end"/>
       </w:r>
     </w:p>
@@ -957,12 +777,6 @@
         <w:instrText xml:space="preserve"> PAGEREF _Toc_cap30 \h </w:instrText>
       </w:r>
       <w:r>
-        <w:fldChar w:fldCharType="separate"/>
-      </w:r>
-      <w:r>
-        <w:t xml:space="preserve">149</w:t>
-      </w:r>
-      <w:r>
         <w:fldChar w:fldCharType="end"/>
       </w:r>
     </w:p>
@@ -983,12 +797,6 @@
         <w:instrText xml:space="preserve"> PAGEREF _Toc_cap31 \h </w:instrText>
       </w:r>
       <w:r>
-        <w:fldChar w:fldCharType="separate"/>
-      </w:r>
-      <w:r>
-        <w:t xml:space="preserve">151</w:t>
-      </w:r>
-      <w:r>
         <w:fldChar w:fldCharType="end"/>
       </w:r>
     </w:p>
@@ -1009,12 +817,6 @@
         <w:instrText xml:space="preserve"> PAGEREF _Toc_cap32 \h </w:instrText>
       </w:r>
       <w:r>
-        <w:fldChar w:fldCharType="separate"/>
-      </w:r>
-      <w:r>
-        <w:t xml:space="preserve">153</w:t>
-      </w:r>
-      <w:r>
         <w:fldChar w:fldCharType="end"/>
       </w:r>
     </w:p>
@@ -1035,12 +837,6 @@
         <w:instrText xml:space="preserve"> PAGEREF _Toc_cap33 \h </w:instrText>
       </w:r>
       <w:r>
-        <w:fldChar w:fldCharType="separate"/>
-      </w:r>
-      <w:r>
-        <w:t xml:space="preserve">155</w:t>
-      </w:r>
-      <w:r>
         <w:fldChar w:fldCharType="end"/>
       </w:r>
     </w:p>
@@ -1061,12 +857,6 @@
         <w:instrText xml:space="preserve"> PAGEREF _Toc_cap34 \h </w:instrText>
       </w:r>
       <w:r>
-        <w:fldChar w:fldCharType="separate"/>
-      </w:r>
-      <w:r>
-        <w:t xml:space="preserve">157</w:t>
-      </w:r>
-      <w:r>
         <w:fldChar w:fldCharType="end"/>
       </w:r>
     </w:p>
@@ -1087,12 +877,6 @@
         <w:instrText xml:space="preserve"> PAGEREF _Toc_cap35 \h </w:instrText>
       </w:r>
       <w:r>
-        <w:fldChar w:fldCharType="separate"/>
-      </w:r>
-      <w:r>
-        <w:t xml:space="preserve">159</w:t>
-      </w:r>
-      <w:r>
         <w:fldChar w:fldCharType="end"/>
       </w:r>
     </w:p>
@@ -1113,12 +897,6 @@
         <w:instrText xml:space="preserve"> PAGEREF _Toc_cap36 \h </w:instrText>
       </w:r>
       <w:r>
-        <w:fldChar w:fldCharType="separate"/>
-      </w:r>
-      <w:r>
-        <w:t xml:space="preserve">161</w:t>
-      </w:r>
-      <w:r>
         <w:fldChar w:fldCharType="end"/>
       </w:r>
     </w:p>
@@ -1139,12 +917,6 @@
         <w:instrText xml:space="preserve"> PAGEREF _Toc_cap37 \h </w:instrText>
       </w:r>
       <w:r>
-        <w:fldChar w:fldCharType="separate"/>
-      </w:r>
-      <w:r>
-        <w:t xml:space="preserve">163</w:t>
-      </w:r>
-      <w:r>
         <w:fldChar w:fldCharType="end"/>
       </w:r>
     </w:p>
@@ -1165,12 +937,6 @@
         <w:instrText xml:space="preserve"> PAGEREF _Toc_cap38 \h </w:instrText>
       </w:r>
       <w:r>
-        <w:fldChar w:fldCharType="separate"/>
-      </w:r>
-      <w:r>
-        <w:t xml:space="preserve">166</w:t>
-      </w:r>
-      <w:r>
         <w:fldChar w:fldCharType="end"/>
       </w:r>
     </w:p>
@@ -1191,12 +957,6 @@
         <w:instrText xml:space="preserve"> PAGEREF _Toc_cap39 \h </w:instrText>
       </w:r>
       <w:r>
-        <w:fldChar w:fldCharType="separate"/>
-      </w:r>
-      <w:r>
-        <w:t xml:space="preserve">168</w:t>
-      </w:r>
-      <w:r>
         <w:fldChar w:fldCharType="end"/>
       </w:r>
     </w:p>
@@ -1217,12 +977,6 @@
         <w:instrText xml:space="preserve"> PAGEREF _Toc_cap40 \h </w:instrText>
       </w:r>
       <w:r>
-        <w:fldChar w:fldCharType="separate"/>
-      </w:r>
-      <w:r>
-        <w:t xml:space="preserve">171</w:t>
-      </w:r>
-      <w:r>
         <w:fldChar w:fldCharType="end"/>
       </w:r>
     </w:p>
@@ -1243,12 +997,6 @@
         <w:instrText xml:space="preserve"> PAGEREF _Toc_cap41 \h </w:instrText>
       </w:r>
       <w:r>
-        <w:fldChar w:fldCharType="separate"/>
-      </w:r>
-      <w:r>
-        <w:t xml:space="preserve">174</w:t>
-      </w:r>
-      <w:r>
         <w:fldChar w:fldCharType="end"/>
       </w:r>
     </w:p>
@@ -1269,12 +1017,6 @@
         <w:instrText xml:space="preserve"> PAGEREF _Toc_cap42 \h </w:instrText>
       </w:r>
       <w:r>
-        <w:fldChar w:fldCharType="separate"/>
-      </w:r>
-      <w:r>
-        <w:t xml:space="preserve">177</w:t>
-      </w:r>
-      <w:r>
         <w:fldChar w:fldCharType="end"/>
       </w:r>
     </w:p>
@@ -1295,12 +1037,6 @@
         <w:instrText xml:space="preserve"> PAGEREF _Toc_cap43 \h </w:instrText>
       </w:r>
       <w:r>
-        <w:fldChar w:fldCharType="separate"/>
-      </w:r>
-      <w:r>
-        <w:t xml:space="preserve">180</w:t>
-      </w:r>
-      <w:r>
         <w:fldChar w:fldCharType="end"/>
       </w:r>
     </w:p>
@@ -1321,12 +1057,6 @@
         <w:instrText xml:space="preserve"> PAGEREF _Toc_cap44 \h </w:instrText>
       </w:r>
       <w:r>
-        <w:fldChar w:fldCharType="separate"/>
-      </w:r>
-      <w:r>
-        <w:t xml:space="preserve">183</w:t>
-      </w:r>
-      <w:r>
         <w:fldChar w:fldCharType="end"/>
       </w:r>
     </w:p>
@@ -1347,12 +1077,6 @@
         <w:instrText xml:space="preserve"> PAGEREF _Toc_cap45 \h </w:instrText>
       </w:r>
       <w:r>
-        <w:fldChar w:fldCharType="separate"/>
-      </w:r>
-      <w:r>
-        <w:t xml:space="preserve">186</w:t>
-      </w:r>
-      <w:r>
         <w:fldChar w:fldCharType="end"/>
       </w:r>
     </w:p>
@@ -1373,12 +1097,6 @@
         <w:instrText xml:space="preserve"> PAGEREF _Toc_cap46 \h </w:instrText>
       </w:r>
       <w:r>
-        <w:fldChar w:fldCharType="separate"/>
-      </w:r>
-      <w:r>
-        <w:t xml:space="preserve">189</w:t>
-      </w:r>
-      <w:r>
         <w:fldChar w:fldCharType="end"/>
       </w:r>
     </w:p>
@@ -1399,12 +1117,6 @@
         <w:instrText xml:space="preserve"> PAGEREF _Toc_cap47 \h </w:instrText>
       </w:r>
       <w:r>
-        <w:fldChar w:fldCharType="separate"/>
-      </w:r>
-      <w:r>
-        <w:t xml:space="preserve">192</w:t>
-      </w:r>
-      <w:r>
         <w:fldChar w:fldCharType="end"/>
       </w:r>
     </w:p>
@@ -1425,12 +1137,6 @@
         <w:instrText xml:space="preserve"> PAGEREF _Toc_cap48 \h </w:instrText>
       </w:r>
       <w:r>
-        <w:fldChar w:fldCharType="separate"/>
-      </w:r>
-      <w:r>
-        <w:t xml:space="preserve">196</w:t>
-      </w:r>
-      <w:r>
         <w:fldChar w:fldCharType="end"/>
       </w:r>
     </w:p>
@@ -1451,12 +1157,6 @@
         <w:instrText xml:space="preserve"> PAGEREF _Toc_cap49 \h </w:instrText>
       </w:r>
       <w:r>
-        <w:fldChar w:fldCharType="separate"/>
-      </w:r>
-      <w:r>
-        <w:t xml:space="preserve">200</w:t>
-      </w:r>
-      <w:r>
         <w:fldChar w:fldCharType="end"/>
       </w:r>
     </w:p>
@@ -1477,12 +1177,6 @@
         <w:instrText xml:space="preserve"> PAGEREF _Toc_cap50 \h </w:instrText>
       </w:r>
       <w:r>
-        <w:fldChar w:fldCharType="separate"/>
-      </w:r>
-      <w:r>
-        <w:t xml:space="preserve">203</w:t>
-      </w:r>
-      <w:r>
         <w:fldChar w:fldCharType="end"/>
       </w:r>
     </w:p>
@@ -1503,12 +1197,6 @@
         <w:instrText xml:space="preserve"> PAGEREF _Toc_cap51 \h </w:instrText>
       </w:r>
       <w:r>
-        <w:fldChar w:fldCharType="separate"/>
-      </w:r>
-      <w:r>
-        <w:t xml:space="preserve">206</w:t>
-      </w:r>
-      <w:r>
         <w:fldChar w:fldCharType="end"/>
       </w:r>
     </w:p>
@@ -1529,12 +1217,6 @@
         <w:instrText xml:space="preserve"> PAGEREF _Toc_cap52 \h </w:instrText>
       </w:r>
       <w:r>
-        <w:fldChar w:fldCharType="separate"/>
-      </w:r>
-      <w:r>
-        <w:t xml:space="preserve">210</w:t>
-      </w:r>
-      <w:r>
         <w:fldChar w:fldCharType="end"/>
       </w:r>
     </w:p>
@@ -1555,12 +1237,6 @@
         <w:instrText xml:space="preserve"> PAGEREF _Toc_cap53 \h </w:instrText>
       </w:r>
       <w:r>
-        <w:fldChar w:fldCharType="separate"/>
-      </w:r>
-      <w:r>
-        <w:t xml:space="preserve">212</w:t>
-      </w:r>
-      <w:r>
         <w:fldChar w:fldCharType="end"/>
       </w:r>
     </w:p>
@@ -1581,12 +1257,6 @@
         <w:instrText xml:space="preserve"> PAGEREF _Toc_cap54 \h </w:instrText>
       </w:r>
       <w:r>
-        <w:fldChar w:fldCharType="separate"/>
-      </w:r>
-      <w:r>
-        <w:t xml:space="preserve">215</w:t>
-      </w:r>
-      <w:r>
         <w:fldChar w:fldCharType="end"/>
       </w:r>
     </w:p>
@@ -1607,12 +1277,6 @@
         <w:instrText xml:space="preserve"> PAGEREF _Toc_cap55 \h </w:instrText>
       </w:r>
       <w:r>
-        <w:fldChar w:fldCharType="separate"/>
-      </w:r>
-      <w:r>
-        <w:t xml:space="preserve">218</w:t>
-      </w:r>
-      <w:r>
         <w:fldChar w:fldCharType="end"/>
       </w:r>
     </w:p>
@@ -1633,12 +1297,6 @@
         <w:instrText xml:space="preserve"> PAGEREF _Toc_cap56 \h </w:instrText>
       </w:r>
       <w:r>
-        <w:fldChar w:fldCharType="separate"/>
-      </w:r>
-      <w:r>
-        <w:t xml:space="preserve">220</w:t>
-      </w:r>
-      <w:r>
         <w:fldChar w:fldCharType="end"/>
       </w:r>
     </w:p>
@@ -1659,12 +1317,6 @@
         <w:instrText xml:space="preserve"> PAGEREF _Toc_cap57 \h </w:instrText>
       </w:r>
       <w:r>
-        <w:fldChar w:fldCharType="separate"/>
-      </w:r>
-      <w:r>
-        <w:t xml:space="preserve">223</w:t>
-      </w:r>
-      <w:r>
         <w:fldChar w:fldCharType="end"/>
       </w:r>
     </w:p>
@@ -1685,12 +1337,6 @@
         <w:instrText xml:space="preserve"> PAGEREF _Toc_cap58 \h </w:instrText>
       </w:r>
       <w:r>
-        <w:fldChar w:fldCharType="separate"/>
-      </w:r>
-      <w:r>
-        <w:t xml:space="preserve">225</w:t>
-      </w:r>
-      <w:r>
         <w:fldChar w:fldCharType="end"/>
       </w:r>
     </w:p>
@@ -1711,12 +1357,6 @@
         <w:instrText xml:space="preserve"> PAGEREF _Toc_cap59 \h </w:instrText>
       </w:r>
       <w:r>
-        <w:fldChar w:fldCharType="separate"/>
-      </w:r>
-      <w:r>
-        <w:t xml:space="preserve">227</w:t>
-      </w:r>
-      <w:r>
         <w:fldChar w:fldCharType="end"/>
       </w:r>
     </w:p>
@@ -1737,12 +1377,6 @@
         <w:instrText xml:space="preserve"> PAGEREF _Toc_cap60 \h </w:instrText>
       </w:r>
       <w:r>
-        <w:fldChar w:fldCharType="separate"/>
-      </w:r>
-      <w:r>
-        <w:t xml:space="preserve">230</w:t>
-      </w:r>
-      <w:r>
         <w:fldChar w:fldCharType="end"/>
       </w:r>
     </w:p>
@@ -1763,12 +1397,6 @@
         <w:instrText xml:space="preserve"> PAGEREF _Toc_cap61 \h </w:instrText>
       </w:r>
       <w:r>
-        <w:fldChar w:fldCharType="separate"/>
-      </w:r>
-      <w:r>
-        <w:t xml:space="preserve">232</w:t>
-      </w:r>
-      <w:r>
         <w:fldChar w:fldCharType="end"/>
       </w:r>
     </w:p>
@@ -1789,12 +1417,6 @@
         <w:instrText xml:space="preserve"> PAGEREF _Toc_cap62 \h </w:instrText>
       </w:r>
       <w:r>
-        <w:fldChar w:fldCharType="separate"/>
-      </w:r>
-      <w:r>
-        <w:t xml:space="preserve">234</w:t>
-      </w:r>
-      <w:r>
         <w:fldChar w:fldCharType="end"/>
       </w:r>
     </w:p>
@@ -1815,12 +1437,6 @@
         <w:instrText xml:space="preserve"> PAGEREF _Toc_cap63 \h </w:instrText>
       </w:r>
       <w:r>
-        <w:fldChar w:fldCharType="separate"/>
-      </w:r>
-      <w:r>
-        <w:t xml:space="preserve">236</w:t>
-      </w:r>
-      <w:r>
         <w:fldChar w:fldCharType="end"/>
       </w:r>
     </w:p>
@@ -1841,12 +1457,6 @@
         <w:instrText xml:space="preserve"> PAGEREF _Toc_cap64 \h </w:instrText>
       </w:r>
       <w:r>
-        <w:fldChar w:fldCharType="separate"/>
-      </w:r>
-      <w:r>
-        <w:t xml:space="preserve">238</w:t>
-      </w:r>
-      <w:r>
         <w:fldChar w:fldCharType="end"/>
       </w:r>
     </w:p>
@@ -1867,12 +1477,6 @@
         <w:instrText xml:space="preserve"> PAGEREF _Toc_cap65 \h </w:instrText>
       </w:r>
       <w:r>
-        <w:fldChar w:fldCharType="separate"/>
-      </w:r>
-      <w:r>
-        <w:t xml:space="preserve">240</w:t>
-      </w:r>
-      <w:r>
         <w:fldChar w:fldCharType="end"/>
       </w:r>
     </w:p>
@@ -1893,12 +1497,6 @@
         <w:instrText xml:space="preserve"> PAGEREF _Toc_cap66 \h </w:instrText>
       </w:r>
       <w:r>
-        <w:fldChar w:fldCharType="separate"/>
-      </w:r>
-      <w:r>
-        <w:t xml:space="preserve">242</w:t>
-      </w:r>
-      <w:r>
         <w:fldChar w:fldCharType="end"/>
       </w:r>
     </w:p>
@@ -1919,12 +1517,6 @@
         <w:instrText xml:space="preserve"> PAGEREF _Toc_cap67 \h </w:instrText>
       </w:r>
       <w:r>
-        <w:fldChar w:fldCharType="separate"/>
-      </w:r>
-      <w:r>
-        <w:t xml:space="preserve">245</w:t>
-      </w:r>
-      <w:r>
         <w:fldChar w:fldCharType="end"/>
       </w:r>
     </w:p>
@@ -1945,12 +1537,6 @@
         <w:instrText xml:space="preserve"> PAGEREF _Toc_cap68 \h </w:instrText>
       </w:r>
       <w:r>
-        <w:fldChar w:fldCharType="separate"/>
-      </w:r>
-      <w:r>
-        <w:t xml:space="preserve">247</w:t>
-      </w:r>
-      <w:r>
         <w:fldChar w:fldCharType="end"/>
       </w:r>
     </w:p>
@@ -1971,12 +1557,6 @@
         <w:instrText xml:space="preserve"> PAGEREF _Toc_cap69 \h </w:instrText>
       </w:r>
       <w:r>
-        <w:fldChar w:fldCharType="separate"/>
-      </w:r>
-      <w:r>
-        <w:t xml:space="preserve">249</w:t>
-      </w:r>
-      <w:r>
         <w:fldChar w:fldCharType="end"/>
       </w:r>
     </w:p>
@@ -1997,12 +1577,6 @@
         <w:instrText xml:space="preserve"> PAGEREF _Toc_cap70 \h </w:instrText>
       </w:r>
       <w:r>
-        <w:fldChar w:fldCharType="separate"/>
-      </w:r>
-      <w:r>
-        <w:t xml:space="preserve">251</w:t>
-      </w:r>
-      <w:r>
         <w:fldChar w:fldCharType="end"/>
       </w:r>
     </w:p>
@@ -2023,12 +1597,6 @@
         <w:instrText xml:space="preserve"> PAGEREF _Toc_cap71 \h </w:instrText>
       </w:r>
       <w:r>
-        <w:fldChar w:fldCharType="separate"/>
-      </w:r>
-      <w:r>
-        <w:t xml:space="preserve">254</w:t>
-      </w:r>
-      <w:r>
         <w:fldChar w:fldCharType="end"/>
       </w:r>
     </w:p>
@@ -2049,12 +1617,6 @@
         <w:instrText xml:space="preserve"> PAGEREF _Toc_cap72 \h </w:instrText>
       </w:r>
       <w:r>
-        <w:fldChar w:fldCharType="separate"/>
-      </w:r>
-      <w:r>
-        <w:t xml:space="preserve">256</w:t>
-      </w:r>
-      <w:r>
         <w:fldChar w:fldCharType="end"/>
       </w:r>
     </w:p>
@@ -2075,12 +1637,6 @@
         <w:instrText xml:space="preserve"> PAGEREF _Toc_cap73 \h </w:instrText>
       </w:r>
       <w:r>
-        <w:fldChar w:fldCharType="separate"/>
-      </w:r>
-      <w:r>
-        <w:t xml:space="preserve">258</w:t>
-      </w:r>
-      <w:r>
         <w:fldChar w:fldCharType="end"/>
       </w:r>
     </w:p>
@@ -2101,12 +1657,6 @@
         <w:instrText xml:space="preserve"> PAGEREF _Toc_cap74 \h </w:instrText>
       </w:r>
       <w:r>
-        <w:fldChar w:fldCharType="separate"/>
-      </w:r>
-      <w:r>
-        <w:t xml:space="preserve">260</w:t>
-      </w:r>
-      <w:r>
         <w:fldChar w:fldCharType="end"/>
       </w:r>
     </w:p>
@@ -2127,12 +1677,6 @@
         <w:instrText xml:space="preserve"> PAGEREF _Toc_cap75 \h </w:instrText>
       </w:r>
       <w:r>
-        <w:fldChar w:fldCharType="separate"/>
-      </w:r>
-      <w:r>
-        <w:t xml:space="preserve">262</w:t>
-      </w:r>
-      <w:r>
         <w:fldChar w:fldCharType="end"/>
       </w:r>
     </w:p>
@@ -2153,12 +1697,6 @@
         <w:instrText xml:space="preserve"> PAGEREF _Toc_cap76 \h </w:instrText>
       </w:r>
       <w:r>
-        <w:fldChar w:fldCharType="separate"/>
-      </w:r>
-      <w:r>
-        <w:t xml:space="preserve">265</w:t>
-      </w:r>
-      <w:r>
         <w:fldChar w:fldCharType="end"/>
       </w:r>
     </w:p>
@@ -2179,12 +1717,6 @@
         <w:instrText xml:space="preserve"> PAGEREF _Toc_cap77 \h </w:instrText>
       </w:r>
       <w:r>
-        <w:fldChar w:fldCharType="separate"/>
-      </w:r>
-      <w:r>
-        <w:t xml:space="preserve">267</w:t>
-      </w:r>
-      <w:r>
         <w:fldChar w:fldCharType="end"/>
       </w:r>
     </w:p>
@@ -2205,12 +1737,6 @@
         <w:instrText xml:space="preserve"> PAGEREF _Toc_cap78 \h </w:instrText>
       </w:r>
       <w:r>
-        <w:fldChar w:fldCharType="separate"/>
-      </w:r>
-      <w:r>
-        <w:t xml:space="preserve">271</w:t>
-      </w:r>
-      <w:r>
         <w:fldChar w:fldCharType="end"/>
       </w:r>
     </w:p>
@@ -2231,12 +1757,6 @@
         <w:instrText xml:space="preserve"> PAGEREF _Toc_cap79 \h </w:instrText>
       </w:r>
       <w:r>
-        <w:fldChar w:fldCharType="separate"/>
-      </w:r>
-      <w:r>
-        <w:t xml:space="preserve">274</w:t>
-      </w:r>
-      <w:r>
         <w:fldChar w:fldCharType="end"/>
       </w:r>
     </w:p>
@@ -2257,12 +1777,6 @@
         <w:instrText xml:space="preserve"> PAGEREF _Toc_cap80 \h </w:instrText>
       </w:r>
       <w:r>
-        <w:fldChar w:fldCharType="separate"/>
-      </w:r>
-      <w:r>
-        <w:t xml:space="preserve">276</w:t>
-      </w:r>
-      <w:r>
         <w:fldChar w:fldCharType="end"/>
       </w:r>
     </w:p>
@@ -2283,12 +1797,6 @@
         <w:instrText xml:space="preserve"> PAGEREF _Toc_cap81 \h </w:instrText>
       </w:r>
       <w:r>
-        <w:fldChar w:fldCharType="separate"/>
-      </w:r>
-      <w:r>
-        <w:t xml:space="preserve">279</w:t>
-      </w:r>
-      <w:r>
         <w:fldChar w:fldCharType="end"/>
       </w:r>
     </w:p>
@@ -2309,12 +1817,6 @@
         <w:instrText xml:space="preserve"> PAGEREF _Toc_cap82 \h </w:instrText>
       </w:r>
       <w:r>
-        <w:fldChar w:fldCharType="separate"/>
-      </w:r>
-      <w:r>
-        <w:t xml:space="preserve">282</w:t>
-      </w:r>
-      <w:r>
         <w:fldChar w:fldCharType="end"/>
       </w:r>
     </w:p>
@@ -2335,12 +1837,6 @@
         <w:instrText xml:space="preserve"> PAGEREF _Toc_cap83 \h </w:instrText>
       </w:r>
       <w:r>
-        <w:fldChar w:fldCharType="separate"/>
-      </w:r>
-      <w:r>
-        <w:t xml:space="preserve">284</w:t>
-      </w:r>
-      <w:r>
         <w:fldChar w:fldCharType="end"/>
       </w:r>
     </w:p>
@@ -2361,12 +1857,6 @@
         <w:instrText xml:space="preserve"> PAGEREF _Toc_cap84 \h </w:instrText>
       </w:r>
       <w:r>
-        <w:fldChar w:fldCharType="separate"/>
-      </w:r>
-      <w:r>
-        <w:t xml:space="preserve">287</w:t>
-      </w:r>
-      <w:r>
         <w:fldChar w:fldCharType="end"/>
       </w:r>
     </w:p>
@@ -2387,12 +1877,6 @@
         <w:instrText xml:space="preserve"> PAGEREF _Toc_cap85 \h </w:instrText>
       </w:r>
       <w:r>
-        <w:fldChar w:fldCharType="separate"/>
-      </w:r>
-      <w:r>
-        <w:t xml:space="preserve">290</w:t>
-      </w:r>
-      <w:r>
         <w:fldChar w:fldCharType="end"/>
       </w:r>
     </w:p>
@@ -2413,12 +1897,6 @@
         <w:instrText xml:space="preserve"> PAGEREF _Toc_cap86 \h </w:instrText>
       </w:r>
       <w:r>
-        <w:fldChar w:fldCharType="separate"/>
-      </w:r>
-      <w:r>
-        <w:t xml:space="preserve">292</w:t>
-      </w:r>
-      <w:r>
         <w:fldChar w:fldCharType="end"/>
       </w:r>
     </w:p>
@@ -2439,12 +1917,6 @@
         <w:instrText xml:space="preserve"> PAGEREF _Toc_cap87 \h </w:instrText>
       </w:r>
       <w:r>
-        <w:fldChar w:fldCharType="separate"/>
-      </w:r>
-      <w:r>
-        <w:t xml:space="preserve">295</w:t>
-      </w:r>
-      <w:r>
         <w:fldChar w:fldCharType="end"/>
       </w:r>
     </w:p>
@@ -2465,12 +1937,6 @@
         <w:instrText xml:space="preserve"> PAGEREF _Toc_cap88 \h </w:instrText>
       </w:r>
       <w:r>
-        <w:fldChar w:fldCharType="separate"/>
-      </w:r>
-      <w:r>
-        <w:t xml:space="preserve">297</w:t>
-      </w:r>
-      <w:r>
         <w:fldChar w:fldCharType="end"/>
       </w:r>
     </w:p>
@@ -2491,12 +1957,6 @@
         <w:instrText xml:space="preserve"> PAGEREF _Toc_cap89 \h </w:instrText>
       </w:r>
       <w:r>
-        <w:fldChar w:fldCharType="separate"/>
-      </w:r>
-      <w:r>
-        <w:t xml:space="preserve">300</w:t>
-      </w:r>
-      <w:r>
         <w:fldChar w:fldCharType="end"/>
       </w:r>
     </w:p>
@@ -2517,12 +1977,6 @@
         <w:instrText xml:space="preserve"> PAGEREF _Toc_cap90 \h </w:instrText>
       </w:r>
       <w:r>
-        <w:fldChar w:fldCharType="separate"/>
-      </w:r>
-      <w:r>
-        <w:t xml:space="preserve">302</w:t>
-      </w:r>
-      <w:r>
         <w:fldChar w:fldCharType="end"/>
       </w:r>
     </w:p>
@@ -2543,12 +1997,6 @@
         <w:instrText xml:space="preserve"> PAGEREF _Toc_cap91 \h </w:instrText>
       </w:r>
       <w:r>
-        <w:fldChar w:fldCharType="separate"/>
-      </w:r>
-      <w:r>
-        <w:t xml:space="preserve">304</w:t>
-      </w:r>
-      <w:r>
         <w:fldChar w:fldCharType="end"/>
       </w:r>
     </w:p>
@@ -2569,12 +2017,6 @@
         <w:instrText xml:space="preserve"> PAGEREF _Toc_cap92 \h </w:instrText>
       </w:r>
       <w:r>
-        <w:fldChar w:fldCharType="separate"/>
-      </w:r>
-      <w:r>
-        <w:t xml:space="preserve">306</w:t>
-      </w:r>
-      <w:r>
         <w:fldChar w:fldCharType="end"/>
       </w:r>
     </w:p>
@@ -2595,12 +2037,6 @@
         <w:instrText xml:space="preserve"> PAGEREF _Toc_cap93 \h </w:instrText>
       </w:r>
       <w:r>
-        <w:fldChar w:fldCharType="separate"/>
-      </w:r>
-      <w:r>
-        <w:t xml:space="preserve">308</w:t>
-      </w:r>
-      <w:r>
         <w:fldChar w:fldCharType="end"/>
       </w:r>
     </w:p>
@@ -2621,12 +2057,6 @@
         <w:instrText xml:space="preserve"> PAGEREF _Toc_cap94 \h </w:instrText>
       </w:r>
       <w:r>
-        <w:fldChar w:fldCharType="separate"/>
-      </w:r>
-      <w:r>
-        <w:t xml:space="preserve">310</w:t>
-      </w:r>
-      <w:r>
         <w:fldChar w:fldCharType="end"/>
       </w:r>
     </w:p>
@@ -2647,12 +2077,6 @@
         <w:instrText xml:space="preserve"> PAGEREF _Toc_cap95 \h </w:instrText>
       </w:r>
       <w:r>
-        <w:fldChar w:fldCharType="separate"/>
-      </w:r>
-      <w:r>
-        <w:t xml:space="preserve">312</w:t>
-      </w:r>
-      <w:r>
         <w:fldChar w:fldCharType="end"/>
       </w:r>
     </w:p>
@@ -2673,12 +2097,6 @@
         <w:instrText xml:space="preserve"> PAGEREF _Toc_cap96 \h </w:instrText>
       </w:r>
       <w:r>
-        <w:fldChar w:fldCharType="separate"/>
-      </w:r>
-      <w:r>
-        <w:t xml:space="preserve">314</w:t>
-      </w:r>
-      <w:r>
         <w:fldChar w:fldCharType="end"/>
       </w:r>
     </w:p>
@@ -2699,12 +2117,6 @@
         <w:instrText xml:space="preserve"> PAGEREF _Toc_cap97 \h </w:instrText>
       </w:r>
       <w:r>
-        <w:fldChar w:fldCharType="separate"/>
-      </w:r>
-      <w:r>
-        <w:t xml:space="preserve">316</w:t>
-      </w:r>
-      <w:r>
         <w:fldChar w:fldCharType="end"/>
       </w:r>
     </w:p>
@@ -2725,12 +2137,6 @@
         <w:instrText xml:space="preserve"> PAGEREF _Toc_cap98 \h </w:instrText>
       </w:r>
       <w:r>
-        <w:fldChar w:fldCharType="separate"/>
-      </w:r>
-      <w:r>
-        <w:t xml:space="preserve">319</w:t>
-      </w:r>
-      <w:r>
         <w:fldChar w:fldCharType="end"/>
       </w:r>
     </w:p>
@@ -2751,12 +2157,6 @@
         <w:instrText xml:space="preserve"> PAGEREF _Toc_cap99 \h </w:instrText>
       </w:r>
       <w:r>
-        <w:fldChar w:fldCharType="separate"/>
-      </w:r>
-      <w:r>
-        <w:t xml:space="preserve">321</w:t>
-      </w:r>
-      <w:r>
         <w:fldChar w:fldCharType="end"/>
       </w:r>
     </w:p>
@@ -2777,12 +2177,6 @@
         <w:instrText xml:space="preserve"> PAGEREF _Toc_cap100 \h </w:instrText>
       </w:r>
       <w:r>
-        <w:fldChar w:fldCharType="separate"/>
-      </w:r>
-      <w:r>
-        <w:t xml:space="preserve">323</w:t>
-      </w:r>
-      <w:r>
         <w:fldChar w:fldCharType="end"/>
       </w:r>
     </w:p>
@@ -2801,12 +2195,6 @@
       </w:r>
       <w:r>
         <w:instrText xml:space="preserve"> PAGEREF _Toc_apendices \h </w:instrText>
-      </w:r>
-      <w:r>
-        <w:fldChar w:fldCharType="separate"/>
-      </w:r>
-      <w:r>
-        <w:t xml:space="preserve">325</w:t>
       </w:r>
       <w:r>
         <w:fldChar w:fldCharType="end"/>
@@ -3288,6 +2676,14 @@
         <w:pStyle w:val="Novela"/>
       </w:pPr>
       <w:r>
+        <w:t>La masa no era uniforme. Desde la línea se veían las siluetas distintas: los altos de piernas largas al frente, empujando sin frenar; detrás, los bajos y anchos, arrastrándose con los hombros por delante; a los costados, los curvos que se quedaban parados y lanzaban desde lejos; y entre todos, los bloques que no se movían, que solo estaban ahí para que no se pudiera rodear. Cientos salían de cada portal. Miles, contados desde los tejados.</w:t>
+      </w:r>
+    </w:p>
+    <w:p>
+      <w:pPr>
+        <w:pStyle w:val="Novela"/>
+      </w:pPr>
+      <w:r>
         <w:t>Nakahara disparó. Los disparos no pararon a la grande, pero la mantuvieron a distancia suficiente para que la línea volviera a formarse. Aoki nunca olvidó que fue Nakahara, la de las tres hijas, la que sostuvo el hueco de la línea mientras él temblaba con el arma contra el hombro.</w:t>
       </w:r>
     </w:p>
@@ -3536,7 +2932,7 @@
         <w:pStyle w:val="Novela"/>
       </w:pPr>
       <w:r>
-        <w:t>Las órdenes no habían llegado de ningún despacho. La primera decisión del ejército, esa mañana, se tomó por analogía: se dispara a lo que se mueve. Los helicópteros abrieron fuego desde el aire, y las líneas trazadoras bajaron sobre la avenida en dos haces exactos, mordiendo la cabeza de la columna de criaturas. Algunas cayeron. Cayeron de lado, arrastrando el asfalto tres metros, y las que venían detrás las esquivaron sin bajar la marcha, como el agua esquiva una piedra.</w:t>
+        <w:t>Las órdenes no habían llegado de ningún despacho. La primera decisión del ejército, esa mañana, se tomó por analogía: se dispara a lo que se mueve. Los helicópteros abrieron fuego desde el aire, y las líneas trazadoras bajaron sobre la avenida en dos haces exactos, mordiendo la cabeza de la columna de criaturas. Algunas cayeron. Cayeron de lado, arrastrando el asfalto tres metros, y las que venían detrás las esquivaron sin bajar la marcha, como el agua esquiva una piedra. La columna no tenía fin: cada portal que se abría detrás dejaba salir otra fila, y la fila se juntaba con la anterior como se juntan los ríos, sin prisa, sin mirarse, todas a lo mismo.</w:t>
       </w:r>
     </w:p>
     <w:p>
@@ -5990,7 +5386,7 @@
         <w:pStyle w:val="Novela"/>
       </w:pPr>
       <w:r>
-        <w:t>Eran tres kaiyu del tamaño aproximado de un caballo, con el cuerpo bajo y los hombros altos, la piel del color de la hierba muerta y un amarillo desvaído en la zona del hombro, como una mancha de sol. No caminaron. Salieron corriendo, a esa velocidad que no corresponde a un animal de ese tamaño, con las rodillas raspando el asfalto en un chirrido seco que se oía desde las esquinas.</w:t>
+        <w:t>Eran tres kaiyu del tamaño aproximado de un caballo, con el cuerpo bajo y los hombros altos, la piel del color de la hierba muerta y un amarillo desvaído en la zona del hombro, como una mancha de sol. No caminaron. Salieron corriendo, a esa velocidad que no corresponde a un animal de ese tamaño, con las rodillas raspando el asfalto en un chirrido seco que se oía desde las esquinas. Detrás de ellos, más despacio, un cuarto kaiyu se quedó parado en la boca de la puerta: no corría, no embestía, se alzaba sobre dos patas largas y lanzaba desde lejos con los brazos colgando, y su boca en el centro del torso se abría y se cerraba como una brasa.</w:t>
       </w:r>
     </w:p>
     <w:p>
@@ -6038,7 +5434,7 @@
         <w:pStyle w:val="Novela"/>
       </w:pPr>
       <w:r>
-        <w:t>Kawano estaba a diez metros. Se apartó contra un auto, con el bolso apretado contra el pecho, y ni uno de los tres kaiyu lo miró. Pasaron a su lado como pasan los trenes: sin detenerse, sin apartarse, sin notar su presencia. Todos iban a lo mismo. Todos tenían la cabeza baja y corrían hacia la misma esquina, hacia el mismo sonido, hacia lo mismo.</w:t>
+        <w:t>Kawano estaba a diez metros. Se apartó contra un auto, con el bolso apretado contra el pecho, y ni uno de los cuatro kaiyu lo miró. Los tres de delante pasaron a su lado como pasan los trenes: sin detenerse, sin apartarse, sin notar su presencia. El cuarto se quedó atrás, lanzando. Todos iban a lo mismo. Los tres tenían la cabeza baja y corrían hacia la misma esquina, hacia el mismo sonido, hacia lo mismo.</w:t>
       </w:r>
     </w:p>
     <w:p>
@@ -6118,7 +5514,7 @@
         <w:pStyle w:val="Novela"/>
       </w:pPr>
       <w:r>
-        <w:t>La calle se llenó de sirenas. Un auto volcado humeaba en la esquina del parque. Humo abajo, sirenas arriba, cinco kaiyu ya en la calle, corriendo a lo mismo, y nadie que pudiera contarlos porque nadie los miraba de frente.</w:t>
+        <w:t>La calle se llenó de sirenas. Un auto volcado humeaba en la esquina del parque. Humo abajo, sirenas arriba, cinco kaiyu ya en la calle: tres de cuerpo bajo que corrían con la cabeza gacha, uno de bloque que no corría sino que avanzaba, y uno curvo que se quedó en la esquina, alzado sobre patas juntas, lanzando desde lejos. Nadie que pudiera contarlos porque nadie los miraba de frente.</w:t>
       </w:r>
     </w:p>
     <w:p>
@@ -6166,7 +5562,7 @@
         <w:pStyle w:val="Novela"/>
       </w:pPr>
       <w:r>
-        <w:t>No porque no quisiera: porque a los setenta y cuatro años el cuerpo decide por uno, y el suyo decidió quedarse quieto en el medio de la calle, con las llaves de su casa temblando en el bolsillo del delantal y los ojos puestos en las tres siluetas altas que corrían hacia ella a la velocidad de una cosa que no es un animal.</w:t>
+        <w:t>No porque no quisiera: porque a los setenta y cuatro años el cuerpo decide por uno, y el suyo decidió quedarse quieto en el medio de la calle, con las llaves de su casa temblando en el bolsillo del delantal y los ojos puestos en las tres siluetas altas que corrían hacia ella a la velocidad de una cosa que no es un animal, y en la cuarta, quieta, alzada sobre patas largas, que no corría pero que lanzaba.</w:t>
       </w:r>
     </w:p>
     <w:p>
@@ -11983,7 +11379,7 @@
         <w:pStyle w:val="Novela"/>
       </w:pPr>
       <w:r>
-        <w:t>Cinco kaiyu amarillos salieron de la boca del callejón, uno a uno, en fila, sin prisa, con esa marcha lenta de los de línea y la cabeza gacha al ángulo de siempre. No era un encuentro. Era una jauría. Venían caminando como quien viene a hacer las rondas de la noche, y el primero llevaba el paso del que ya sabe dónde va a parar.</w:t>
+        <w:t>Cinco kaiyu amarillos salieron de la boca del callejón, uno a uno, en fila, sin prisa, con esa marcha lenta de los de línea y la cabeza gacha al ángulo de siempre. No era un encuentro. Era una jauría. Los tres primeros eran de cuerpo bajo, con los hombros altos y las rodillas raspando el asfalto. El cuarto era más ancho, un bloque que no corría sino que avanzaba, con una placa frontal que le cubría el pecho como una tapa. El quinto se quedó en la boca del callejón, alzado sobre patas largas, con la boca en el centro del torso abriéndose y cerrándose. Venían caminando como quien viene a hacer las rondas de la noche, y el primero llevaba el paso del que ya sabe dónde va a parar.</w:t>
       </w:r>
     </w:p>
     <w:p>
@@ -12015,7 +11411,7 @@
         <w:pStyle w:val="Novela"/>
       </w:pPr>
       <w:r>
-        <w:t>El primero embistió. Goro no esquivó: bloqueó. El escudo cantó con ese golpe sordo, contenido, que sabía el cuerpo de Goro palabra por palabra, y el kaiyu rebotó y el segundo ya venía, y Goro bloqueó, y el tercero, y Goro bloqueó, y el cuarto, y el quinto, y la calle entera iba jadeando con él, que es una manera de decir que jadeaba él, porque la ciudad seguía fingiendo dormir.</w:t>
+        <w:t>El primero embistió. Goro no esquivó: bloqueó. El escudo cantó con ese golpe sordo, contenido, que sabía el cuerpo de Goro palabra por palabra, y el kaiyu rebotó y el segundo ya venía, y Goro bloqueó, y el tercero, y Goro bloqueó. El cuarto no embistió: avanzó con la placa frontal por delante, empujando como un muro, y Goro tuvo que apartarse porque el golpe del escudo contra la placa no rebotó, lo empujó. El quinto se quedó en la boca del callejón, lanzando desde lejos, y el proyectil pasó por encima del hombro de Goro y dio en la fachada del puesto del tomate. La calle entera iba jadeando con él, que es una manera de decir que jadeaba él, porque la ciudad seguía fingiendo dormir.</w:t>
       </w:r>
     </w:p>
     <w:p>
@@ -12063,7 +11459,7 @@
         <w:pStyle w:val="Novela"/>
       </w:pPr>
       <w:r>
-        <w:t>El cuarto kaiyu embistió en ese momento.</w:t>
+        <w:t>El cuarto kaiyu avanzó en ese momento, con la placa frontal por delante, sin correr, empujando con el cuerpo entero.</w:t>
       </w:r>
     </w:p>
     <w:p>
@@ -12103,7 +11499,7 @@
         <w:pStyle w:val="Novela"/>
       </w:pPr>
       <w:r>
-        <w:t>La jauría no entendía de treguas. El quinto embistió, y los tres primeros volvieron, y Goro cambió el ritmo. Ya no bloqueaba de pie, quieto, aguantando: aprovechaba los huecos que le daban los kaiyu cuando embestían en fila y la fila olvidaba que la fila son cinco. Giró el escudo, lo usó de cuña, dividió la jauría, separó al cuarto del quinto, y el guante de brasa le iba marcando el camino, encendiéndose cuando Goro se la pedía y apagándose cuando Goro la guardaba, como un arma que por fin le hacía caso otra vez.</w:t>
+        <w:t>La jauría no entendía de treguas. El quinto lanzó desde la boca del callejón, y los tres primeros volvieron, y Goro cambió el ritmo. Ya no bloqueaba de pie, quieto, aguantando: aprovechaba los huecos que le daban los kaiyu cuando embestían en fila y la fila olvidaba que la fila son tres. Giró el escudo, lo usó de cuña, dividió la jauría, separó al cuarto del tercero, y el guante de brasa le iba marcando el camino, encendiéndose cuando Goro se la pedía y apagándose cuando Goro la guardaba, como un arma que por fin le hacía caso otra vez.</w:t>
       </w:r>
     </w:p>
     <w:p>
@@ -12974,7 +12370,7 @@
         <w:pStyle w:val="Novela"/>
       </w:pPr>
       <w:r>
-        <w:t>No los vieron venir: los vieron estar. Tres kaiyu amarillos, de los de marcha lenta, de los que caminan con la cabeza gacha al ángulo de siempre, el color apagado de los pasillos escolares encendidos. Venían de la calle del fondo, en fila, sin prisa, con esa dirección de las cosas que ya saben dónde van a parar, y a la verja iban a llegar antes que a ninguna otra puerta.</w:t>
+        <w:t>No los vieron venir: los vieron estar. Tres kaiyu amarillos, de los de marcha lenta, de los que caminan con la cabeza gacha al ángulo de siempre, el color apagado de los pasillos escolares encendidos. Dos eran de cuerpo bajo, con los hombros altos y las rodillas raspando el asfalto. El tercero era más ancho, un bloque con una placa frontal que le cubría el pecho como una tapa, que no corría sino que avanzaba. Venían de la calle del fondo, en fila, sin prisa, con esa dirección de las cosas que ya saben dónde van a parar, y a la verja iban a llegar antes que a ninguna otra puerta.</w:t>
       </w:r>
     </w:p>
     <w:p>
@@ -13134,7 +12530,7 @@
         <w:pStyle w:val="Novela"/>
       </w:pPr>
       <w:r>
-        <w:t>Los tres amarillos rodearon la guardería. No era un encuentro: era un sitio, una verja, tres direcciones, y los cuatro aprendiendo que proteger es otra cosa que atacar, que el golpe que se guarda para no romper a quien está detrás pesa más que el que se suelta.</w:t>
+        <w:t>Los tres amarillos rodearon la guardería. No era un encuentro: era un sitio, una verja, tres direcciones, y los cuatro aprendiendo que proteger es otra cosa que atacar, que el golpe que se guarda para no romper a quien está detrás pesa más que el que se suelta. El de la placa frontal no rodeó: fue directo por la verja, empujando con el cuerpo entero.</w:t>
       </w:r>
     </w:p>
     <w:p>
@@ -13150,7 +12546,7 @@
         <w:pStyle w:val="Novela"/>
       </w:pPr>
       <w:r>
-        <w:t>El primer amarillo embistió contra la verja y Goro no lo frenó: lo desvió. El escudo bajó un palmo y el amarillo pasó de largo por donde no estaba el niño, y ya había aprendido el primero lo que costaba el patrón. El segundo vino por el costado, probando el borde izquierdo, y Goro no fue con él: fue con el escudo, que se le deslizó por el suelo y le quitó el paso a la altura de las patas, y el amarillo se zambeó de lado contra la pared de la clase. El tercero se quedó un momento quieto, mirando.</w:t>
+        <w:t>El primer amarillo embistió contra la verja y Goro no lo frenó: lo desvió. El escudo bajó un palmo y el amarillo pasó de largo por donde no estaba el niño, y ya había aprendido el primero lo que costaba el patrón. El segundo vino por el costado, probando el borde izquierdo, y Goro no fue con él: fue con el escudo, que se le deslizó por el suelo y le quitó el paso a la altura de las patas, y el amarillo se zambeó de lado contra la pared de la clase. El tercero no embistió: avanzó con la placa frontal por delante, empujando contra la verja, y el metal de la verja crujó bajo el peso de la placa como crujería una puerta vieja.</w:t>
       </w:r>
     </w:p>
     <w:p>
@@ -13350,23 +12746,23 @@
         <w:pStyle w:val="Novela"/>
       </w:pPr>
       <w:r>
-        <w:t>Goro no preguntó nada más. El turno se repartía solo: Rika filo, Goro muro, Yui distancia, y el sitio de Ren —el más difícil de todos esa mañana— era el sitio de quien ya no tiene velocidad y aun así no se mueve. Los dos amarillos embistieron juntos, porque los kaiyu aprenden, y los dos se encontraron con la misma pared de cuatro piezas, filo y escudo y distancia y un cuerpo sin carga en el medio que ya no era el último.</w:t>
-      </w:r>
-    </w:p>
-    <w:p>
-      <w:pPr>
-        <w:pStyle w:val="Novela"/>
-      </w:pPr>
-      <w:r>
-        <w:t>El segundo cayó cuando giró de más.</w:t>
-      </w:r>
-    </w:p>
-    <w:p>
-      <w:pPr>
-        <w:pStyle w:val="Novela"/>
-      </w:pPr>
-      <w:r>
-        <w:t>El tercero se rompió contra el escudo deslizado, el golpe que Goro conocía de memoria desde la mañana en que la ciudad dejó de seguir a nadie.</w:t>
+        <w:t>Goro no preguntó nada más. El turno se repartía solo: Rika filo, Goro muro, Yui distancia, y el sitio de Ren —el más difícil de todos esa mañana— era el sitio de quien ya no tiene velocidad y aun así no se mueve. Los dos amarillos que quedaban avanzaron juntos: uno embistió con la cabeza baja, el otro empujó con la placa frontal, porque los kaiyu aprenden, y los dos se encontraron con la misma pared de cuatro piezas, filo y escudo y distancia y un cuerpo sin carga en el medio que ya no era el último.</w:t>
+      </w:r>
+    </w:p>
+    <w:p>
+      <w:pPr>
+        <w:pStyle w:val="Novela"/>
+      </w:pPr>
+      <w:r>
+        <w:t>El que embistió cayó cuando giró de más.</w:t>
+      </w:r>
+    </w:p>
+    <w:p>
+      <w:pPr>
+        <w:pStyle w:val="Novela"/>
+      </w:pPr>
+      <w:r>
+        <w:t>El de la placa se rompió contra el escudo deslizado, el golpe que Goro conocía de memoria desde la mañana en que la ciudad dejó de seguir a nadie, y la placa se le astilló en tres grietas antes de ceder.</w:t>
       </w:r>
     </w:p>
     <w:p>
@@ -29051,7 +28447,7 @@
         <w:pStyle w:val="Novela"/>
       </w:pPr>
       <w:r>
-        <w:t>Y así fue. Fue un turno de siete horas en el que no pasó nada, y en el que por eso mismo pasó todo: las horas en que la columna avanzaba detrás de ellos, kilómetro a kilómetro, con las camillas, con los carros, con la mujer mayor y su carro de dos matas, y los kaiyu, cinco mil, apretados al otro lado del estrechamiento, sin poder cruzar, mirándolos.</w:t>
+        <w:t>Y así fue. Fue un turno de siete horas en el que no pasó nada, y en el que por eso mismo pasó todo: las horas en que la columna avanzaba detrás de ellos, kilómetro a kilómetro, con las camillas, con los carros, con la mujer mayor y su carro de dos matas, y los kaiyu, cinco mil, apretados al otro lado del estrechamiento, sin poder cruzar, mirándolos. No era una masa uniforme: entre los de cuerpo bajo y los de hombros altos se veían los bloques que no corrían, y más atrás, alzados sobre patas largas con la boca en el centro del torso abriéndose y cerrándose, los que lanzaban desde lejos sin moverse del sitio.</w:t>
       </w:r>
     </w:p>
     <w:p>
@@ -30486,7 +29882,7 @@
         <w:pStyle w:val="Novela"/>
       </w:pPr>
       <w:r>
-        <w:t>Cuando los cuatro llegaron, el sargento llevaba un rato largo sentado en el suelo con la espalda en la puerta, y a su alrededor, en el pasillo, había once kaiyu muertos y un charco que llegaba hasta la mitad del pasillo.</w:t>
+        <w:t>Cuando los cuatro llegaron, el sargento llevaba un rato largo sentado en el suelo con la espalda en la puerta, y a su alrededor, en el pasillo, había once kaiyu muertos y un charco que llegaba hasta la mitad del pasillo. Entre los de cuerpo bajo y los de hombros altos había uno de bloque, con la placa frontal astillada por la mitad, y otro cuyas grietas cian brillaban todavía en la penumbra, aunque ya no se levantaba.</w:t>
       </w:r>
     </w:p>
     <w:p>
@@ -31562,7 +30958,7 @@
         <w:pStyle w:val="Novela"/>
       </w:pPr>
       <w:r>
-        <w:t>Durante un rato largo, la plaza de Narai fue un sitio en el que nada pasó: tres kaiyu sentados en un borde y cuatro portadores de pie en el otro, mirándose, sin que ninguno de los dos bandos tuviera prisa. Rika bajó la espada. No la guardó. La bajó.</w:t>
+        <w:t>Durante un rato largo, la plaza de Narai fue un sitio en el que nada pasó: tres kaiyu sentados en un borde y cuatro portadores de pie en el otro, mirándose, sin que ninguno de los dos bandos tuviera prisa. Uno de los tres tenía las grietas cian recorriéndole el cuerpo como las de una vasija vieja, y esas grietas brillaban y se apagaban con la respiración, aunque el kaiyu no se movía. Rika bajó la espada. No la guardó. La bajó.</w:t>
       </w:r>
     </w:p>
     <w:p>
@@ -32886,7 +32282,7 @@
         <w:pStyle w:val="Novela"/>
       </w:pPr>
       <w:r>
-        <w:t>Los civiles salieron todos. Los kaiyu, no. Los kaiyu entraron corriendo por la mitad abierta, y Rika, viéndolos entrar, hizo lo que Noda no le había pedido: se metió al túnel, cortó el aire de lado a lado en la boca de la compuerta, y aguantó ahí, en el hueco, mientras la compuerta seguía bajando por encima de su cabeza.</w:t>
+        <w:t>Los civiles salieron todos. Los kaiyu, no. Los kaiyu entraron corriendo por la mitad abierta, y entre ellos venía uno de bloque, con la placa frontal cubriéndole el pecho como una tapa, que no corría sino que avanzaba, empujando con el cuerpo entero contra la corriente de los que huían. Y Rika, viéndolos entrar, hizo lo que Noda no le había pedido: se metió al túnel, cortó el aire de lado a lado en la boca de la compuerta, y aguantó ahí, en el hueco, mientras la compuerta seguía bajando por encima de su cabeza.</w:t>
       </w:r>
     </w:p>
     <w:p>
@@ -41580,7 +40976,7 @@
         <w:pStyle w:val="Novela"/>
       </w:pPr>
       <w:r>
-        <w:t>Fue una pelea larga y dura. Más dura que las últimas. Los kaiyu parecían más decididos, más organizados. Pero los cuatro también luchaban con una coordinación perfeccionada tras años de hacerlo juntos.</w:t>
+        <w:t>Fue una pelea larga y dura. Más dura que las últimas. Los kaiyu parecían más decididos, más organizados. Entre ellos había uno con las grietas cian por todo el cuerpo que brillaban antes de levantarse, y cada vez que lo tumbaban, esas grietas se encendían de nuevo y el kaiyu volvía a ponerse de pie, hasta que lo mataban durante la oleada. Pero los cuatro también luchaban con una coordinación perfeccionada tras años de hacerlo juntos.</w:t>
       </w:r>
     </w:p>
     <w:p>
@@ -47092,7 +46488,7 @@
           <w:b/>
           <w:color w:val="1D3A8A"/>
         </w:rPr>
-        <w:t xml:space="preserve">Jūmoji Tsuyoshi</w:t>
+        <w:t xml:space="preserve">Jumoji Tsuyoshi</w:t>
       </w:r>
       <w:r>
         <w:t xml:space="preserve"> — 36 años; enfermero. Le cose el antebrazo a Rika (cap. 16).</w:t>

</xml_diff>

<commit_message>
Novela: descripciones detalladas de kaiyu en sus primera aparición (caps 01, 02, 13, 21, 24, 38, 58, 63, 64, 70)
</commit_message>
<xml_diff>
--- a/Novela/NPAD_NOVELA.docx
+++ b/Novela/NPAD_NOVELA.docx
@@ -2460,7 +2460,7 @@
         <w:pStyle w:val="Novela"/>
       </w:pPr>
       <w:r>
-        <w:t>La criatura grande, la del peso de un edificio, estaba parada a catorce metros del konbini, con la cabeza ladeada hacia el edificio de enfrente. Tenía el lomo cubierto de una sustancia que brillaba en la oscuridad, y respiraba sin mover la caja del pecho. Shiraishi se quedó mirándola lo bastante tiempo para entender que no era un perro, y entonces la puerta del konbini se cerró, suavemente, detrás de él.</w:t>
+        <w:t>La criatura grande, la del peso de un edificio, estaba parada a catorce metros del konbini, con la cabeza ladeada hacia el edificio de enfrente. Tenía la piel gris de concreto, agrietada como la fachada de un edificio viejo, y de cada grieta le crecía un musgo verde pálido que brillaba en la oscuridad. No tenía nariz: solo dos agujeros grandes en el centro de la cara. La boca era una hendidura ancha, sin labios, que se le abría y cerraba despacio cuando respiraba, sin mover la caja del pecho. Los ojos eran dos bolas negras y brillantes, redondos, sin párpados: no parpadeaban. Los dedos de las manos eran gruesos y largos, con uñas de metal, y las palmas, planas y duras, colgaban a los costados como tablas. Shiraishi se quedó mirándola lo bastante tiempo para entender que no era un perro, y entonces la puerta del konbini se cerró, suavemente, detrás de él.</w:t>
       </w:r>
     </w:p>
     <w:p>
@@ -2852,7 +2852,7 @@
         <w:pStyle w:val="Novela"/>
       </w:pPr>
       <w:r>
-        <w:t>La guardería estaba a dos manzanas. No tuvo tiempo de llegar. A las 5:08 a. m., la última de las puertas grandes se abrió a media altura en la fachada del bloque de enfrente, y del vapor salió la criatura que cierra las puertas. Sato miró el delantal, miró el bloque, y se metió dentro del kiosco con el delantal apretado contra el pecho, como quien esconde una cosa que no sabe a quién devolver.</w:t>
+        <w:t>La guardería estaba a dos manzanas. No tuvo tiempo de llegar. A las 5:08 a. m., la última de las puertas grandes se abrió a media altura en la fachada del bloque de enfrente, y del vapor salió la criatura que cierra las puertas. Medía el alto de dos pisos y tenía la piel gris acero, rugosa, con bultos de óxido que se le desprendían, y un brillo metálico en los hombros. Los ojos le brillaban pequeños, redondos, rojos. De la boca, ancha y sin labios, le salía vapor cada vez que respiraba. Tenía una sola extremidad larga, con una mano de cinco dedos y uñas de metal; la otra era un bloque sin dedos. Sato miró el delantal, miró el bloque, y se metió dentro del kiosco con el delantal apretado contra el pecho, como quien esconde una cosa que no sabe a quién devolver.</w:t>
       </w:r>
     </w:p>
     <w:p>
@@ -4491,7 +4491,7 @@
         <w:pStyle w:val="Novela"/>
       </w:pPr>
       <w:r>
-        <w:t>El kaiyu que salió del hueco era amarillo, del tamaño de un caballo, con el hombro grande y la cabeza hundida entre las patas delanteras, como un animal que nace apresurado. No tenía cara. No tenía ojos. Tenía una forma de caminar, o de no caminar: avanzaba sin moverse, con la masa del cuerpo empujada hacia delante por un mecanismo que no se veía, y al pisar el pasillo, el suelo tembló un dedo, apenas.</w:t>
+        <w:t>El kaiyu que salió del hueco era amarillo, del tamaño de un caballo, con el hombro grande y la cabeza hundida entre las patas delanteras, como un animal que nace apresurado. No tenía cara visible: la llevaba hundida hacia el pecho, y en toda la masa no se le veía ojo ni hocico que mirar. En el lomo le brillaba, bajo la piel más gruesa, una placa ósea con luz propia, del rojo de una brasa. Las manos —o lo que hacía de manos— tenían cuatro dedos cortos, con garras curvas del color del hueso viejo. Tenía una forma de caminar, o de no caminar: avanzaba sin moverse, con la masa del cuerpo empujada hacia delante por un mecanismo que no se veía, y al pisar el pasillo, el suelo tembló un dedo, apenas.</w:t>
       </w:r>
     </w:p>
     <w:p>
@@ -14008,15 +14008,15 @@
         <w:pStyle w:val="Novela"/>
       </w:pPr>
       <w:r>
-        <w:t>El primero en moverse fue el Embestidor, el de hombros grandes y cabeza hundida, que salió de la formación como salen las balas de una escopeta: sin aviso, sin paso previo, todo el peso de los hombros contra el aire. Goro no esquivó. Goro bloqueó, con ese golpe sordo y contenido que era el idioma de su hombro, el que llevaba repasando seis días frente a la puerta de servicio del Sector Seis, y el Amarillo rebotó de la pared del escudo y Goro encajó el segundo, y el tercero, y la explanada entera iba jadeando con él, porque los tres llegaban en línea y la línea no dejaba de empujar. Rika abrió el abanico cuando el Lanzador alzó los brazos largos desde la nave: una hoja de fuego quieto cruzó la distancia, cortó el aire antes del lanzamiento, y obligó al Lanzador a medir de nuevo, a correr la punta del brazo dos metros a la derecha buscando el hueco que la hoja no cubría. Yui no disparó todavía. Yui esperaba, porque Yui no apuntaba a lo que veía: apuntaba a lo que iba a venir, contando —uno, dos, tres— los pasos que les faltaban a las cosas que corren, y mientras tanto sostenía la calle con la sola quietud de su mirada.</w:t>
-      </w:r>
-    </w:p>
-    <w:p>
-      <w:pPr>
-        <w:pStyle w:val="Novela"/>
-      </w:pPr>
-      <w:r>
-        <w:t>El Carrilero vino en línea recta, largo y bajo, sin frenar, y Ren apareció donde el Carrilero iba a estar antes de que estuviera: entre un momento y el siguiente, con la amarilla chillona abriéndose tras él como un pliegue, y lo dejó pasar, y el Carrilero pasó de largo por donde ya no había nadie, y se llevó consigo el impulso que la formación había gastado en él. Ren no lo tocó. Ren no necesitaba tocarlo: necesitaba que el hueco no existiera, y el hueco no existió.</w:t>
+        <w:t>El primero en moverse fue el Embestidor, el de hombros grandes y cabeza hundida, que salió de la formación como salen las balas de una escopeta: sin aviso, sin paso previo, todo el peso de los hombros contra el aire. Goro no esquivó. Goro bloqueó, con ese golpe sordo y contenido que era el idioma de su hombro, el que llevaba repasando seis días frente a la puerta de servicio del Sector Seis, y el Amarillo rebotó de la pared del escudo y Goro encajó el segundo, y el tercero, y la explanada entera iba jadeando con él, porque los tres llegaban en línea y la línea no dejaba de empujar. Rika abrió el abanico cuando el Lanzador alzó los brazos largos desde la nave —dos brazos sin cuello, con dedos tan largos que le colgaban hasta las rodillas—: una hoja de fuego quieto cruzó la distancia, cortó el aire antes del lanzamiento, y obligó al Lanzador a medir de nuevo, a correr la punta del brazo dos metros a la derecha buscando el hueco que la hoja no cubría. Yui no disparó todavía. Yui esperaba, porque Yui no apuntaba a lo que veía: apuntaba a lo que iba a venir, contando —uno, dos, tres— los pasos que les faltaban a las cosas que corren, y mientras tanto sostenía la calle con la sola quietud de su mirada.</w:t>
+      </w:r>
+    </w:p>
+    <w:p>
+      <w:pPr>
+        <w:pStyle w:val="Novela"/>
+      </w:pPr>
+      <w:r>
+        <w:t>El Carrilero vino en línea recta, largo y bajo, sin frenar —los pies planos golpeando el suelo sin levantar nunca los talones—, y Ren apareció donde el Carrilero iba a estar antes de que estuviera: entre un momento y el siguiente, con la amarilla chillona abriéndose tras él como un pliegue, y lo dejó pasar, y el Carrilero pasó de largo por donde ya no había nadie, y se llevó consigo el impulso que la formación había gastado en él. Ren no lo tocó. Ren no necesitaba tocarlo: necesitaba que el hueco no existiera, y el hueco no existió.</w:t>
       </w:r>
     </w:p>
     <w:p>
@@ -14040,7 +14040,7 @@
         <w:pStyle w:val="Novela"/>
       </w:pPr>
       <w:r>
-        <w:t>El Blindado, cuadrado, sin cuello, no se movió. Había que rodearlo. Rika lo rodeó, lo dejó arrinconado donde no estorbaba la fila, en la punta de la vía muerta, quieto como una puerta sin marco, y el Resucitado —encogido, gris, con algo que se movía debajo, con ese tamaño de las cosas caídas que no quieren quedarse caídas— rodó hasta sus pies, se quedó un segundo quieto, y se levantó otra vez. Rika lo vio levantarse y no lo terminó enseguida. Rika lo dejó a medias, con el abanico a medio abrir, y a Goro se le quejó el hombro con él, porque el Resucitado no era un enemigo: era dos movimientos seguidos, y el segundo no venía del sitio donde el primero había caído.</w:t>
+        <w:t>El Blindado, cuadrado, sin cuello, no se movió: la placa frontal, gris como concreto pulido, le cubría el pecho entero, y en el hueco oscuro de la cara solo le brillaban dos puntos blancos, del tamaño de una canica. Había que rodearlo. Rika lo rodeó, lo dejó arrinconado donde no estorbaba la fila, en la punta de la vía muerta, quieto como una puerta sin marco, y el Resucitado —encogido, gris, con las grietas cian recorriéndole el cuerpo y encendiéndose con cada esfuerzo, con algo que se movía debajo, con ese tamaño de las cosas caídas que no quieren quedarse caídas— rodó hasta sus pies, se quedó un segundo quieto, y se levantó otra vez. Rika lo vio levantarse y no lo terminó enseguida. Rika lo dejó a medias, con el abanico a medio abrir, y a Goro se le quejó el hombro con él, porque el Resucitado no era un enemigo: era dos movimientos seguidos, y el segundo no venía del sitio donde el primero había caído.</w:t>
       </w:r>
     </w:p>
     <w:p>
@@ -17496,7 +17496,7 @@
         <w:pStyle w:val="Novela"/>
       </w:pPr>
       <w:r>
-        <w:t>En el centro del patio de maniobras, entre montones de contenedores apilados, se alzaba el Portero Encabezado. Era uno de los ocho grandes. Mucho más corpulento que un naranja corriente, con placas óseas que le recorrían los hombros y brazos, y un cráneo alargado con dos cuernos cortos hacia atrás. Su piel tenía un tono gris oscuro con vetas negruzcas y sus ojos eran dos ranuras carmesí con un brillo cruelmente inteligente.</w:t>
+        <w:t>En el centro del patio de maniobras, entre montones de contenedores apilados, se alzaba el Portero Encabezado. Era uno de los ocho grandes. Medía más de dos metros y era ancho como un contenedor tumbado: piel gris acero, mate, con la textura del hormigón recién vaciado, poros y todo, sin pelo y sin marca. La cabeza era rectangular y no tenía orejas; la cara era lisa, sin rasgos, partida en el centro por una única hendidura vertical que se le abría y cerraba cuando respiraba. No tenía ojos en la cara. El ojo estaba en el centro del pecho: uno solo, rojo, del tamaño de un puño, con iris rojo y pupila negra, que les miró girando en su órbita como el de un reptil. Las manos le colgaban de los costados planas y anchas, como dos puertas abiertas, y cada paso que daba —corto, pesado— le hacía temblar el suelo.</w:t>
       </w:r>
     </w:p>
     <w:p>
@@ -17600,7 +17600,7 @@
         <w:pStyle w:val="Novela"/>
       </w:pPr>
       <w:r>
-        <w:t>Rika aprovechó la apertura para deslizarse bajo el brazo extendido y lanzar una ráfaga de cortes con el abanico, abriendo quemaduras a lo largo de sus costados. Ren zigzagueaba a su alrededor, buscando huecos entre las placas óseas para atacar los puntos más vulnerables. Yui se mantenía a distancia, disparando con frialdad a las articulaciones, buscando debilitar sus movimientos.</w:t>
+        <w:t>Rika aprovechó la apertura para deslizarse bajo el brazo extendido y lanzar una ráfaga de cortes con el abanico, abriendo quemaduras a lo largo de sus costados. Ren zigzagueaba a su alrededor, buscando huecos entre las placas de la piel dura para atacar los puntos más vulnerables. Yui se mantenía a distancia, disparando con frialdad a las articulaciones, buscando debilitar sus movimientos.</w:t>
       </w:r>
     </w:p>
     <w:p>
@@ -17616,7 +17616,7 @@
         <w:pStyle w:val="Novela"/>
       </w:pPr>
       <w:r>
-        <w:t>Al final, tras un impacto conjunto perfectamente sincronizado, el Portero Encabezado trastabilló hacia atrás. Rika se lanzó hacia delante con todo el impulso de su dash y le asestó un corte transversal limpio al cuello, justo donde las placas se separaban.</w:t>
+        <w:t>Al final, tras un impacto conjunto perfectamente sincronizado, el Portero Encabezado trastabilló hacia atrás. Rika se lanzó hacia delante con todo el impulso de su dash y le asestó un corte transversal limpio justo en la hendidura de la cara, donde la piel se abría al respirar.</w:t>
       </w:r>
     </w:p>
     <w:p>
@@ -18717,7 +18717,7 @@
         <w:pStyle w:val="Novela"/>
       </w:pPr>
       <w:r>
-        <w:t>Este rojo era ligeramente distinto al de la tarde. Más imponente. Sus crestas eran más largas y sus estrías negras brillaban con un tono violáceo bajo la luz de las farolas. Sus ojos ámbar los observaban con una inteligencia aguda, calculadora.</w:t>
+        <w:t>Este rojo era ligeramente distinto al de la tarde. Más imponente. Medía lo que mide una persona y estaba parado como se para una persona, con la postura recta de quien no tiene prisa. La piel le era gris pálida, suave, con los poros visibles y venas finas asomando por debajo: la cara más humana que habían visto en un kaiyu, con pómulos, mandíbula y una nariz pequeña y afilada. Tenía cuello, con la manzana de Adán marcada. Los ojos eran alargados y negros, brillantes, sin párpados, y no parpadeaban cuando miraban: lo miraban como miden las cosas que no tienen apuro. Tenían, además, un reflejo que no era de animal: era el reflejo de alguien que piensa.</w:t>
       </w:r>
     </w:p>
     <w:p>
@@ -18733,7 +18733,7 @@
         <w:pStyle w:val="Novela"/>
       </w:pPr>
       <w:r>
-        <w:t>El Asesor inclinó levemente la cabeza hacia un lado, estudiándolos uno por uno. Cuando sus ojos ámbar se posaron en Rika, se detuvo. Se quedó mirándola fijamente durante un instante, con una atención distinta, más blanda, como si en ella reconociera a alguien más pequeño que no estaba allí.</w:t>
+        <w:t>El Asesor inclinó levemente la cabeza hacia un lado, estudiándolos uno por uno. Cuando sus ojos negros se posaron en Rika, se detuvo. Se quedó mirándola fijamente durante un instante, con una atención distinta, más blanda, como si en ella reconociera a alguien más pequeño que no estaba allí.</w:t>
       </w:r>
     </w:p>
     <w:p>
@@ -22383,7 +22383,7 @@
         <w:pStyle w:val="Novela"/>
       </w:pPr>
       <w:r>
-        <w:t>Al principio, Pry se quedó atrás, en una pasarela de hierro, y desde la pasarela hizo lo que hacen los jefes: mandó.</w:t>
+        <w:t>Al principio, Pry se quedó atrás, en una pasarela de hierro, y desde la pasarela hizo lo que hacen los jefes: mandó. Era alto y delgado, de un poco más de dos metros, con la piel pálida cubierta de pelos finos y blancos que le brillaban bajo la luz de los claraboyas, como los de una tarántula. Seis ojos negros y brillantes le cubrían la cara —dos grandes arriba, dos medianos en medio, dos pequeños abajo— y ninguno parpadeaba. Tenía seis brazos, cuatro en lo alto del torso y dos abajo, y con ellos hacía señas a la vez mientras gritaba; las piernas eran cuatro, con articulaciones dobles, y cuando se movía por la pasarela lo hacía en saltos cortos y rápidos, como una araña.</w:t>
       </w:r>
     </w:p>
     <w:p>
@@ -29523,7 +29523,7 @@
         <w:pStyle w:val="Novela"/>
       </w:pPr>
       <w:r>
-        <w:t>Rika lo vio primero, desde lo alto del terraplén: una cosa redonda partida en dos por una grieta, que humeaba por el corte, y que caminaba entre los amarillos como el arado que abre el surco. No corría. No se apresuraba. Cada paso que daba era un paso para que la fila que iba detrás diera un paso, y la fila eran trescientos amarillos que subían por la pendiente hacia el único sitio donde los cuatro podían pararlos.</w:t>
+        <w:t>Rika lo vio primero, desde lo alto del terraplén: una cosa redonda partida en dos por una grieta, que humeaba por el corte, y que caminaba entre los amarillos como el arado que abre el surco. La piel era de hierro oxidado, rugosa, con bultos de óxido que se le desprendían al frotar, y alrededor de la grieta la tenía quemada, negra, agrietada. De la hendidura central —que era su boca— le salía humo con cada respiración. De la masa le salían dos brazos delgados, con cinco dedos y uñas afiladas, que colgaban como ramas de un árbol muerto. No corría. No se apresuraba. Cada paso que daba era un paso para que la fila que iba detrás diera un paso, y la fila eran trescientos amarillos que subían por la pendiente hacia el único sitio donde los cuatro podían pararlos.</w:t>
       </w:r>
     </w:p>
     <w:p>
@@ -30910,7 +30910,7 @@
         <w:pStyle w:val="Novela"/>
       </w:pPr>
       <w:r>
-        <w:t>Los cuatro entraron a Narai a media tarde, con la orden de comprobar si el pueblo seguía en pie. Había quedado en pie a medias: las casas del lado del río, intactas; las del lado del monte, abiertas como se abre una fruta. No había nadie. Ni vivos ni muertos. Solo puertas y ventanas y, en el suelo, la marca de la ceniza que dejaba un Cenicero cuando pasaba, porque un Cenicero nunca se lleva las cosas, solo las pone grises.</w:t>
+        <w:t>Los cuatro entraron a Narai a media tarde, con la orden de comprobar si el pueblo seguía en pie. Había quedado en pie a medias: las casas del lado del río, intactas; las del lado del monte, abiertas como se abre una fruta. No había nadie. Ni vivos ni muertos. Solo puertas y ventanas y, en el suelo, la marca de la ceniza que dejaba un Cenicero cuando pasaba: una estela de polvo gris que se le quedaba clavada en la tierra y en todo lo que tocaba, con las huellas anchas de sus pies planos aún legibles en el barro, porque un Cenicero nunca se lleva las cosas, solo las pone grises, y su zona se vuelve gris para siempre.</w:t>
       </w:r>
     </w:p>
     <w:p>
@@ -31277,7 +31277,7 @@
         <w:pStyle w:val="Novela"/>
       </w:pPr>
       <w:r>
-        <w:t>La naranja no se veía venir de lejos, porque la naranja era lo que quedaba pegado al suelo: una cosa horizontal, sin patas, que se deslizaba por la tierra como se desliza una sombra cuando el sol está muy bajo, y que iba por delante de la columna cubriendo la piedra, borrando el borde, borrando la claridad. Donde pasaba Sombra larga, el suelo dejaba de tener tacto.</w:t>
+        <w:t>La naranja no se veía venir de lejos, porque la naranja era lo que quedaba pegado al suelo: una cosa horizontal, sin patas, de piel negra y mate que no reflejaba la luz sino que se la chupaba, como terciopelo frío. Medía lo largo de un hombre y apenas le llegaba al tobillo de alto. Los ojos le brillaban arriba de la cabeza, redondos y negros, orientados hacia el cielo como los de un cocodrilo, y no parpadeaban. No tenía manos: a los costados le salían aletas cortas y gruesas con las que se deslizaba por la tierra, como se desliza una sombra cuando el sol está muy bajo, y que iba por delante de la columna cubriendo la piedra, borrando el borde, borrando la claridad. Donde pasaba Sombra larga, el suelo dejaba de tener tacto.</w:t>
       </w:r>
     </w:p>
     <w:p>
@@ -32807,7 +32807,7 @@
         <w:pStyle w:val="Novela"/>
       </w:pPr>
       <w:r>
-        <w:t>Aterrizaron a un kilómetro, en un claro, y desde allí el anclaje se veía al fondo, quieto, del tamaño de un bloque de viviendas, sin una sola luz.</w:t>
+        <w:t>Aterrizaron a un kilómetro, en un claro, y desde allí el anclaje se veía al fondo, quieto, del tamaño de un bloque de viviendas, sin una sola luz salvo la del ojo: un solo ojo grande, vertical, rojo, en el centro de la cara, que no parpadeaba. La piel era casi negra, dura y agrietada, como roca madre o como la corteza de un árbol viejo. Bajo el cuerpo, las patas —o lo que hacía de patas— le quedaban hundidas en la tierra, clavadas como raíces, y por eso no se movía. Era un punto fijo, y alrededor del punto fijo se organizaba todo lo demás.</w:t>
       </w:r>
     </w:p>
     <w:p>

</xml_diff>